<commit_message>
improve LawCompass document tools and contract templates and some UI changes
</commit_message>
<xml_diff>
--- a/Templates/Employee_Contract.docx
+++ b/Templates/Employee_Contract.docx
@@ -360,7 +360,7 @@
                                 <w:color w:val="000000"/>
                                 <w:sz w:val="23"/>
                               </w:rPr>
-                              <w:t>LawBuddy</w:t>
+                              <w:t>LawCompass</w:t>
                             </w:r>
                             <w:proofErr w:type="spellEnd"/>
                             <w:r>
@@ -600,7 +600,7 @@
                           <w:color w:val="000000"/>
                           <w:sz w:val="23"/>
                         </w:rPr>
-                        <w:t>LawBuddy</w:t>
+                        <w:t>LawCompass</w:t>
                       </w:r>
                       <w:proofErr w:type="spellEnd"/>
                       <w:r>
@@ -5129,7 +5129,7 @@
         <w:b/>
         <w:sz w:val="18"/>
       </w:rPr>
-      <w:t>LawBuddy</w:t>
+      <w:t>LawCompass</w:t>
     </w:r>
     <w:proofErr w:type="spellEnd"/>
     <w:r>

</xml_diff>